<commit_message>
Finlir på inlämningsuppgiften del 1
</commit_message>
<xml_diff>
--- a/Inlämningsuppgift 1 del 1 My Tistelberg.docx
+++ b/Inlämningsuppgift 1 del 1 My Tistelberg.docx
@@ -44,15 +44,7 @@
           <w:bCs/>
           <w:lang w:val="sv-SE"/>
         </w:rPr>
-        <w:t>1.</w:t>
-      </w:r>
-      <w:r>
-        <w:rPr>
-          <w:b/>
-          <w:bCs/>
-          <w:lang w:val="sv-SE"/>
-        </w:rPr>
-        <w:t xml:space="preserve">Har något varit utmanande i kursen/kunskapskontrollerna? Om ja, hur har du hanterat det? </w:t>
+        <w:t xml:space="preserve">1.Har något varit utmanande i kursen/kunskapskontrollerna? Om ja, hur har du hanterat det? </w:t>
       </w:r>
     </w:p>
     <w:p>
@@ -71,7 +63,25 @@
         <w:rPr>
           <w:lang w:val="sv-SE"/>
         </w:rPr>
-        <w:t xml:space="preserve">. Men jag tycker din struktur har fungerat bra och bara genom att följa alla uppgifter </w:t>
+        <w:t>. Men jag tycker din struktur har fungerat bra och bara genom att följa</w:t>
+      </w:r>
+      <w:r>
+        <w:rPr>
+          <w:lang w:val="sv-SE"/>
+        </w:rPr>
+        <w:t xml:space="preserve"> den och göra</w:t>
+      </w:r>
+      <w:r>
+        <w:rPr>
+          <w:lang w:val="sv-SE"/>
+        </w:rPr>
+        <w:t xml:space="preserve"> alla uppgifter </w:t>
+      </w:r>
+      <w:r>
+        <w:rPr>
+          <w:lang w:val="sv-SE"/>
+        </w:rPr>
+        <w:t xml:space="preserve">när de var planerade </w:t>
       </w:r>
       <w:r>
         <w:rPr>
@@ -250,7 +260,6 @@
         <w:rPr>
           <w:b/>
           <w:bCs/>
-          <w:color w:val="EE0000"/>
           <w:lang w:val="sv-SE"/>
         </w:rPr>
         <w:t xml:space="preserve">1. </w:t>
@@ -481,43 +490,7 @@
         <w:rPr>
           <w:lang w:val="sv-SE"/>
         </w:rPr>
-        <w:t xml:space="preserve">I denna fas ska </w:t>
-      </w:r>
-      <w:r>
-        <w:rPr>
-          <w:lang w:val="sv-SE"/>
-        </w:rPr>
-        <w:t xml:space="preserve">man </w:t>
-      </w:r>
-      <w:r>
-        <w:rPr>
-          <w:lang w:val="sv-SE"/>
-        </w:rPr>
-        <w:t xml:space="preserve">inte tänka på hur </w:t>
-      </w:r>
-      <w:r>
-        <w:rPr>
-          <w:lang w:val="sv-SE"/>
-        </w:rPr>
-        <w:t>problemet ska</w:t>
-      </w:r>
-      <w:r>
-        <w:rPr>
-          <w:lang w:val="sv-SE"/>
-        </w:rPr>
-        <w:t xml:space="preserve"> lösa</w:t>
-      </w:r>
-      <w:r>
-        <w:rPr>
-          <w:lang w:val="sv-SE"/>
-        </w:rPr>
-        <w:t>s</w:t>
-      </w:r>
-      <w:r>
-        <w:rPr>
-          <w:lang w:val="sv-SE"/>
-        </w:rPr>
-        <w:t xml:space="preserve"> utan </w:t>
+        <w:t xml:space="preserve">I denna fas ska man inte tänka på hur problemet ska lösas utan </w:t>
       </w:r>
       <w:r>
         <w:rPr>
@@ -778,25 +751,7 @@
         <w:rPr>
           <w:lang w:val="sv-SE"/>
         </w:rPr>
-        <w:t>När alla idéer är tömda så r</w:t>
-      </w:r>
-      <w:r>
-        <w:rPr>
-          <w:lang w:val="sv-SE"/>
-        </w:rPr>
-        <w:t>östa</w:t>
-      </w:r>
-      <w:r>
-        <w:rPr>
-          <w:lang w:val="sv-SE"/>
-        </w:rPr>
-        <w:t>r vi</w:t>
-      </w:r>
-      <w:r>
-        <w:rPr>
-          <w:lang w:val="sv-SE"/>
-        </w:rPr>
-        <w:t xml:space="preserve"> på idéerna </w:t>
+        <w:t xml:space="preserve">När alla idéer är tömda så röstar vi på idéerna </w:t>
       </w:r>
       <w:r>
         <w:rPr>
@@ -2706,6 +2661,7 @@
   <w:style w:type="character" w:default="1" w:styleId="Standardstycketeckensnitt">
     <w:name w:val="Default Paragraph Font"/>
     <w:uiPriority w:val="1"/>
+    <w:semiHidden/>
     <w:unhideWhenUsed/>
   </w:style>
   <w:style w:type="table" w:default="1" w:styleId="Normaltabell">

</xml_diff>